<commit_message>
Point report GitHub link at the published LostLink repository
</commit_message>
<xml_diff>
--- a/docs/LostLink_Phase1_Report.docx
+++ b/docs/LostLink_Phase1_Report.docx
@@ -7104,12 +7104,12 @@
         <w:spacing w:after="160" w:line="276"/>
         <w:jc w:val="both"/>
       </w:pPr>
-      <w:hyperlink w:history="1" r:id="rIdcrbcy1rv6htxvctz79ryi">
+      <w:hyperlink w:history="1" r:id="rIdgrisutg-b4cnzd5d6qwoj">
         <w:r>
           <w:rPr>
             <w:rStyle w:val="Hyperlink"/>
           </w:rPr>
-          <w:t xml:space="preserve">github.com/Said-Abdullah-Al-Sawafi/lostlink-comp4701</w:t>
+          <w:t xml:space="preserve">github.com/Said-Abdullah-Al-Sawafi/LostLink</w:t>
         </w:r>
       </w:hyperlink>
     </w:p>

</xml_diff>